<commit_message>
fix: convert cover letter bold to italics, update ARI -> Three-Pillar Assessment
Refs #506

Co-Authored-By: Claude Opus 4.6 (1M context) <noreply@anthropic.com>
</commit_message>
<xml_diff>
--- a/ARCHIVED/20260329_JMIR-Submission/cover-letter.docx
+++ b/ARCHIVED/20260329_JMIR-Submission/cover-letter.docx
@@ -42,8 +42,8 @@
       </w:r>
       <w:r>
         <w:rPr>
-          <w:b/>
-          <w:bCs/>
+          <w:i/>
+          <w:iCs/>
         </w:rPr>
         <w:t xml:space="preserve">Viewpoint</w:t>
       </w:r>
@@ -113,8 +113,8 @@
       </w:pPr>
       <w:r>
         <w:rPr>
-          <w:b/>
-          <w:bCs/>
+          <w:i/>
+          <w:iCs/>
         </w:rPr>
         <w:t xml:space="preserve">Structural changes:</w:t>
       </w:r>
@@ -161,8 +161,8 @@
       </w:pPr>
       <w:r>
         <w:rPr>
-          <w:b/>
-          <w:bCs/>
+          <w:i/>
+          <w:iCs/>
         </w:rPr>
         <w:t xml:space="preserve">Content focus:</w:t>
       </w:r>
@@ -185,8 +185,8 @@
       </w:pPr>
       <w:r>
         <w:rPr>
-          <w:b/>
-          <w:bCs/>
+          <w:i/>
+          <w:iCs/>
         </w:rPr>
         <w:t xml:space="preserve">Human-in-the-Loop Knowledge Governance (HITL-KG) framework:</w:t>
       </w:r>
@@ -207,8 +207,8 @@
       </w:pPr>
       <w:r>
         <w:rPr>
-          <w:b/>
-          <w:bCs/>
+          <w:i/>
+          <w:iCs/>
         </w:rPr>
         <w:t xml:space="preserve">Theoretical grounding in Nonaka’s SECI model:</w:t>
       </w:r>
@@ -229,8 +229,8 @@
       </w:pPr>
       <w:r>
         <w:rPr>
-          <w:b/>
-          <w:bCs/>
+          <w:i/>
+          <w:iCs/>
         </w:rPr>
         <w:t xml:space="preserve">The Validator Paradox:</w:t>
       </w:r>
@@ -257,16 +257,16 @@
       </w:pPr>
       <w:r>
         <w:rPr>
-          <w:b/>
-          <w:bCs/>
+          <w:i/>
+          <w:iCs/>
         </w:rPr>
-        <w:t xml:space="preserve">Analytics Resilience Index (ARI):</w:t>
+        <w:t xml:space="preserve">Three-Pillar Assessment Rubric:</w:t>
       </w:r>
       <w:r>
         <w:t xml:space="preserve"> </w:t>
       </w:r>
       <w:r>
-        <w:t xml:space="preserve">A proposed measurement instrument complementing static maturity models with dynamic resilience metrics</w:t>
+        <w:t xml:space="preserve">A structured self-assessment tool with evidence-based indicators across analytics maturity, workforce agility, and technical enablement</w:t>
       </w:r>
     </w:p>
     <w:p>
@@ -279,8 +279,8 @@
       </w:pPr>
       <w:r>
         <w:rPr>
-          <w:b/>
-          <w:bCs/>
+          <w:i/>
+          <w:iCs/>
         </w:rPr>
         <w:t xml:space="preserve">Three pillars of evidence:</w:t>
       </w:r>
@@ -297,8 +297,8 @@
       </w:pPr>
       <w:r>
         <w:rPr>
-          <w:b/>
-          <w:bCs/>
+          <w:i/>
+          <w:iCs/>
         </w:rPr>
         <w:t xml:space="preserve">Quality assurance:</w:t>
       </w:r>
@@ -361,8 +361,8 @@
       </w:r>
       <w:r>
         <w:rPr>
-          <w:b/>
-          <w:bCs/>
+          <w:i/>
+          <w:iCs/>
         </w:rPr>
         <w:t xml:space="preserve">Viewpoint</w:t>
       </w:r>

</xml_diff>

<commit_message>
fix: propagate user's cover letter edits and regenerate artifacts
- Simplified rejection description ("length concern and submission type")
- Removed "substantially" and word count comparison
- Changed "5,000-word recommendation" to "5,000-word limit"
- Simplified content focus intro
- Added "analytics" to "healthcare analytics workforce"

Refs #506

Co-Authored-By: Claude Opus 4.6 (1M context) <noreply@anthropic.com>
</commit_message>
<xml_diff>
--- a/ARCHIVED/20260329_JMIR-Submission/cover-letter.docx
+++ b/ARCHIVED/20260329_JMIR-Submission/cover-letter.docx
@@ -80,13 +80,7 @@
         <w:t xml:space="preserve"> </w:t>
       </w:r>
       <w:r>
-        <w:t xml:space="preserve">and the invitation to resubmit after addressing the length concern. The original submission was approximately 12,730 words, which the editor correctly identified as</w:t>
-      </w:r>
-      <w:r>
-        <w:t xml:space="preserve"> </w:t>
-      </w:r>
-      <w:r>
-        <w:t xml:space="preserve">“thesis length.”</w:t>
+        <w:t xml:space="preserve">and the invitation to resubmit after addressing the length concern and submission type.</w:t>
       </w:r>
     </w:p>
     <w:bookmarkEnd w:id="9"/>
@@ -104,7 +98,7 @@
         <w:pStyle w:val="FirstParagraph"/>
       </w:pPr>
       <w:r>
-        <w:t xml:space="preserve">The manuscript has been substantially revised to meet Viewpoint article requirements:</w:t>
+        <w:t xml:space="preserve">The manuscript has been revised to meet Viewpoint article requirements:</w:t>
       </w:r>
     </w:p>
     <w:p>
@@ -128,7 +122,7 @@
         </w:numPr>
       </w:pPr>
       <w:r>
-        <w:t xml:space="preserve">Reduced from approximately 12,730 words to approximately 4,600 body words (within the 5,000-word recommendation)</w:t>
+        <w:t xml:space="preserve">Reduced to approximately 4,600 body words (within the 5,000-word limit)</w:t>
       </w:r>
     </w:p>
     <w:p>
@@ -172,7 +166,7 @@
         <w:pStyle w:val="BodyText"/>
       </w:pPr>
       <w:r>
-        <w:t xml:space="preserve">The revised manuscript retains the core intellectual contributions while removing the exhaustive methodology and literature review sections appropriate for a full research paper:</w:t>
+        <w:t xml:space="preserve">The revised manuscript retains the core intellectual contributions while removing the exhaustive methodology and literature review sections:</w:t>
       </w:r>
     </w:p>
     <w:p>
@@ -216,7 +210,7 @@
         <w:t xml:space="preserve"> </w:t>
       </w:r>
       <w:r>
-        <w:t xml:space="preserve">Reinterpretation of knowledge creation theory for the unstable healthcare workforce</w:t>
+        <w:t xml:space="preserve">Reinterpretation of knowledge creation theory for the unstable healthcare analytics workforce</w:t>
       </w:r>
     </w:p>
     <w:p>

</xml_diff>